<commit_message>
funcTeoria de la info
</commit_message>
<xml_diff>
--- a/2do-Cuatrimestre/Programacion-C/ProyectoProgramacionC.docx
+++ b/2do-Cuatrimestre/Programacion-C/ProyectoProgramacionC.docx
@@ -642,7 +642,25 @@
                                 <w:sz w:val="32"/>
                                 <w:szCs w:val="36"/>
                               </w:rPr>
-                              <w:t xml:space="preserve"> Octubre </w:t>
+                              <w:t xml:space="preserve"> </w:t>
+                            </w:r>
+                            <w:proofErr w:type="gramStart"/>
+                            <w:r>
+                              <w:rPr>
+                                <w:rFonts w:ascii="Cambria Math" w:hAnsi="Cambria Math" w:cs="Times New Roman"/>
+                                <w:sz w:val="32"/>
+                                <w:szCs w:val="36"/>
+                              </w:rPr>
+                              <w:t>Octubre</w:t>
+                            </w:r>
+                            <w:proofErr w:type="gramEnd"/>
+                            <w:r>
+                              <w:rPr>
+                                <w:rFonts w:ascii="Cambria Math" w:hAnsi="Cambria Math" w:cs="Times New Roman"/>
+                                <w:sz w:val="32"/>
+                                <w:szCs w:val="36"/>
+                              </w:rPr>
+                              <w:t xml:space="preserve"> </w:t>
                             </w:r>
                             <w:r>
                               <w:rPr>
@@ -1297,7 +1315,25 @@
                           <w:sz w:val="32"/>
                           <w:szCs w:val="36"/>
                         </w:rPr>
-                        <w:t xml:space="preserve"> Octubre </w:t>
+                        <w:t xml:space="preserve"> </w:t>
+                      </w:r>
+                      <w:proofErr w:type="gramStart"/>
+                      <w:r>
+                        <w:rPr>
+                          <w:rFonts w:ascii="Cambria Math" w:hAnsi="Cambria Math" w:cs="Times New Roman"/>
+                          <w:sz w:val="32"/>
+                          <w:szCs w:val="36"/>
+                        </w:rPr>
+                        <w:t>Octubre</w:t>
+                      </w:r>
+                      <w:proofErr w:type="gramEnd"/>
+                      <w:r>
+                        <w:rPr>
+                          <w:rFonts w:ascii="Cambria Math" w:hAnsi="Cambria Math" w:cs="Times New Roman"/>
+                          <w:sz w:val="32"/>
+                          <w:szCs w:val="36"/>
+                        </w:rPr>
+                        <w:t xml:space="preserve"> </w:t>
                       </w:r>
                       <w:r>
                         <w:rPr>
@@ -1668,7 +1704,19 @@
         <w:rPr>
           <w:rFonts w:ascii="Bahnschrift" w:hAnsi="Bahnschrift"/>
         </w:rPr>
-        <w:t>Facturación al Paciente, Reportes de Actividad de los Médicos (con suma de honorarios), Resolución de Conflictos de Sala de Espera.</w:t>
+        <w:t>Facturación al Paciente, Reportes de Actividad de los Médicos (con suma de honorarios), Resolución de Conflictos de Sala de Espera</w:t>
+      </w:r>
+      <w:r>
+        <w:rPr>
+          <w:rFonts w:ascii="Bahnschrift" w:hAnsi="Bahnschrift"/>
+        </w:rPr>
+        <w:t>, gestión de Asociados, simulación de uso de una Ambulancia, persistencia de datos y una interfaz gráfica de usuario</w:t>
+      </w:r>
+      <w:r>
+        <w:rPr>
+          <w:rFonts w:ascii="Bahnschrift" w:hAnsi="Bahnschrift"/>
+        </w:rPr>
+        <w:t>.</w:t>
       </w:r>
       <w:r>
         <w:rPr>
@@ -1688,7 +1736,19 @@
         <w:rPr>
           <w:rFonts w:ascii="Bahnschrift" w:hAnsi="Bahnschrift"/>
         </w:rPr>
-        <w:t>En esta primera entrega del informe se</w:t>
+        <w:t xml:space="preserve">En </w:t>
+      </w:r>
+      <w:r>
+        <w:rPr>
+          <w:rFonts w:ascii="Bahnschrift" w:hAnsi="Bahnschrift"/>
+        </w:rPr>
+        <w:t xml:space="preserve">esta instancia </w:t>
+      </w:r>
+      <w:r>
+        <w:rPr>
+          <w:rFonts w:ascii="Bahnschrift" w:hAnsi="Bahnschrift"/>
+        </w:rPr>
+        <w:t>se</w:t>
       </w:r>
       <w:r>
         <w:rPr>
@@ -1742,7 +1802,7 @@
         <w:rPr>
           <w:rFonts w:ascii="Bahnschrift" w:hAnsi="Bahnschrift"/>
         </w:rPr>
-        <w:t xml:space="preserve"> y el patrón </w:t>
+        <w:t xml:space="preserve"> el patrón </w:t>
       </w:r>
       <w:r>
         <w:rPr>
@@ -1751,6 +1811,70 @@
           <w:iCs/>
         </w:rPr>
         <w:t>Double Dispatch</w:t>
+      </w:r>
+      <w:r>
+        <w:rPr>
+          <w:rFonts w:ascii="Bahnschrift" w:hAnsi="Bahnschrift"/>
+          <w:i/>
+          <w:iCs/>
+        </w:rPr>
+        <w:t xml:space="preserve">, </w:t>
+      </w:r>
+      <w:r>
+        <w:rPr>
+          <w:rFonts w:ascii="Bahnschrift" w:hAnsi="Bahnschrift"/>
+        </w:rPr>
+        <w:t xml:space="preserve">el patrón </w:t>
+      </w:r>
+      <w:r>
+        <w:rPr>
+          <w:rFonts w:ascii="Bahnschrift" w:hAnsi="Bahnschrift"/>
+          <w:i/>
+          <w:iCs/>
+        </w:rPr>
+        <w:t>Observer/Observable</w:t>
+      </w:r>
+      <w:r>
+        <w:rPr>
+          <w:rFonts w:ascii="Bahnschrift" w:hAnsi="Bahnschrift"/>
+        </w:rPr>
+        <w:t xml:space="preserve">, </w:t>
+      </w:r>
+      <w:r>
+        <w:rPr>
+          <w:rFonts w:ascii="Bahnschrift" w:hAnsi="Bahnschrift"/>
+          <w:i/>
+          <w:iCs/>
+        </w:rPr>
+        <w:t>MVC</w:t>
+      </w:r>
+      <w:r>
+        <w:rPr>
+          <w:rFonts w:ascii="Bahnschrift" w:hAnsi="Bahnschrift"/>
+        </w:rPr>
+        <w:t xml:space="preserve">, el patrón </w:t>
+      </w:r>
+      <w:r>
+        <w:rPr>
+          <w:rFonts w:ascii="Bahnschrift" w:hAnsi="Bahnschrift"/>
+          <w:i/>
+          <w:iCs/>
+        </w:rPr>
+        <w:t xml:space="preserve">State </w:t>
+      </w:r>
+      <w:r>
+        <w:rPr>
+          <w:rFonts w:ascii="Bahnschrift" w:hAnsi="Bahnschrift"/>
+        </w:rPr>
+        <w:t xml:space="preserve">y el patrón </w:t>
+      </w:r>
+      <w:r>
+        <w:rPr>
+          <w:rFonts w:ascii="Bahnschrift" w:hAnsi="Bahnschrift"/>
+          <w:i/>
+          <w:iCs/>
+        </w:rPr>
+        <w:t>DAO/DTO</w:t>
       </w:r>
       <w:r>
         <w:rPr>
@@ -2274,8 +2398,16 @@
               <w:rPr>
                 <w:rFonts w:ascii="Consolas" w:hAnsi="Consolas"/>
               </w:rPr>
-              <w:t>public PacienteNino(</w:t>
-            </w:r>
+              <w:t xml:space="preserve">public </w:t>
+            </w:r>
+            <w:proofErr w:type="gramStart"/>
+            <w:r>
+              <w:rPr>
+                <w:rFonts w:ascii="Consolas" w:hAnsi="Consolas"/>
+              </w:rPr>
+              <w:t>PacienteNino(</w:t>
+            </w:r>
+            <w:proofErr w:type="gramEnd"/>
             <w:r>
               <w:rPr>
                 <w:rFonts w:ascii="Consolas" w:hAnsi="Consolas"/>
@@ -2307,7 +2439,35 @@
                 <w:rFonts w:ascii="Consolas" w:hAnsi="Consolas"/>
               </w:rPr>
               <w:br/>
-              <w:t>        super(nombre, apellido, dni, domicilio, telefono,fechaIngreso,   nroHistoriaMedica);</w:t>
+              <w:t xml:space="preserve">        </w:t>
+            </w:r>
+            <w:proofErr w:type="gramStart"/>
+            <w:r>
+              <w:rPr>
+                <w:rFonts w:ascii="Consolas" w:hAnsi="Consolas"/>
+              </w:rPr>
+              <w:t>super(</w:t>
+            </w:r>
+            <w:proofErr w:type="gramEnd"/>
+            <w:r>
+              <w:rPr>
+                <w:rFonts w:ascii="Consolas" w:hAnsi="Consolas"/>
+              </w:rPr>
+              <w:t xml:space="preserve">nombre, apellido, dni, domicilio, </w:t>
+            </w:r>
+            <w:proofErr w:type="gramStart"/>
+            <w:r>
+              <w:rPr>
+                <w:rFonts w:ascii="Consolas" w:hAnsi="Consolas"/>
+              </w:rPr>
+              <w:t>telefono,fechaIngreso</w:t>
+            </w:r>
+            <w:proofErr w:type="gramEnd"/>
+            <w:r>
+              <w:rPr>
+                <w:rFonts w:ascii="Consolas" w:hAnsi="Consolas"/>
+              </w:rPr>
+              <w:t>,   nroHistoriaMedica);</w:t>
             </w:r>
             <w:r>
               <w:rPr>
@@ -2336,14 +2496,50 @@
                 <w:rFonts w:ascii="Consolas" w:hAnsi="Consolas"/>
               </w:rPr>
               <w:br/>
-              <w:t>public boolean prioridad(Paciente paciente){</w:t>
-            </w:r>
+              <w:t xml:space="preserve">public boolean </w:t>
+            </w:r>
+            <w:proofErr w:type="gramStart"/>
+            <w:r>
+              <w:rPr>
+                <w:rFonts w:ascii="Consolas" w:hAnsi="Consolas"/>
+              </w:rPr>
+              <w:t>prioridad(</w:t>
+            </w:r>
+            <w:proofErr w:type="gramEnd"/>
+            <w:r>
+              <w:rPr>
+                <w:rFonts w:ascii="Consolas" w:hAnsi="Consolas"/>
+              </w:rPr>
+              <w:t xml:space="preserve">Paciente </w:t>
+            </w:r>
+            <w:proofErr w:type="gramStart"/>
+            <w:r>
+              <w:rPr>
+                <w:rFonts w:ascii="Consolas" w:hAnsi="Consolas"/>
+              </w:rPr>
+              <w:t>paciente){</w:t>
+            </w:r>
+            <w:proofErr w:type="gramEnd"/>
             <w:r>
               <w:rPr>
                 <w:rFonts w:ascii="Consolas" w:hAnsi="Consolas"/>
               </w:rPr>
               <w:br/>
-              <w:t>    return paciente.prioridadConNino();</w:t>
+              <w:t xml:space="preserve">    return </w:t>
+            </w:r>
+            <w:proofErr w:type="gramStart"/>
+            <w:r>
+              <w:rPr>
+                <w:rFonts w:ascii="Consolas" w:hAnsi="Consolas"/>
+              </w:rPr>
+              <w:t>paciente.prioridadConNino</w:t>
+            </w:r>
+            <w:proofErr w:type="gramEnd"/>
+            <w:r>
+              <w:rPr>
+                <w:rFonts w:ascii="Consolas" w:hAnsi="Consolas"/>
+              </w:rPr>
+              <w:t>();</w:t>
             </w:r>
             <w:r>
               <w:rPr>
@@ -2370,8 +2566,16 @@
                 <w:rFonts w:ascii="Consolas" w:hAnsi="Consolas"/>
               </w:rPr>
               <w:br/>
-              <w:t>public boolean prioridadConJoven(){</w:t>
-            </w:r>
+              <w:t xml:space="preserve">public boolean </w:t>
+            </w:r>
+            <w:proofErr w:type="gramStart"/>
+            <w:r>
+              <w:rPr>
+                <w:rFonts w:ascii="Consolas" w:hAnsi="Consolas"/>
+              </w:rPr>
+              <w:t>prioridadConJoven(){</w:t>
+            </w:r>
+            <w:proofErr w:type="gramEnd"/>
             <w:r>
               <w:rPr>
                 <w:rFonts w:ascii="Consolas" w:hAnsi="Consolas"/>
@@ -2412,8 +2616,16 @@
                 <w:rFonts w:ascii="Consolas" w:hAnsi="Consolas"/>
               </w:rPr>
               <w:br/>
-              <w:t>public boolean prioridadConMayor(){</w:t>
-            </w:r>
+              <w:t xml:space="preserve">public boolean </w:t>
+            </w:r>
+            <w:proofErr w:type="gramStart"/>
+            <w:r>
+              <w:rPr>
+                <w:rFonts w:ascii="Consolas" w:hAnsi="Consolas"/>
+              </w:rPr>
+              <w:t>prioridadConMayor(){</w:t>
+            </w:r>
+            <w:proofErr w:type="gramEnd"/>
             <w:r>
               <w:rPr>
                 <w:rFonts w:ascii="Consolas" w:hAnsi="Consolas"/>
@@ -2448,8 +2660,16 @@
                 <w:rFonts w:ascii="Consolas" w:hAnsi="Consolas"/>
               </w:rPr>
               <w:br/>
-              <w:t>public boolean prioridadConNino(){</w:t>
-            </w:r>
+              <w:t xml:space="preserve">public boolean </w:t>
+            </w:r>
+            <w:proofErr w:type="gramStart"/>
+            <w:r>
+              <w:rPr>
+                <w:rFonts w:ascii="Consolas" w:hAnsi="Consolas"/>
+              </w:rPr>
+              <w:t>prioridadConNino(){</w:t>
+            </w:r>
+            <w:proofErr w:type="gramEnd"/>
             <w:r>
               <w:rPr>
                 <w:rFonts w:ascii="Consolas" w:hAnsi="Consolas"/>
@@ -2772,8 +2992,33 @@
                 <w:lang w:val="en-US"/>
               </w:rPr>
               <w:br/>
-              <w:t xml:space="preserve">   if(titulo.equalsIgnoreCase("magister")){</w:t>
-            </w:r>
+              <w:t xml:space="preserve">   if(</w:t>
+            </w:r>
+            <w:proofErr w:type="gramStart"/>
+            <w:r>
+              <w:rPr>
+                <w:rFonts w:ascii="Consolas" w:hAnsi="Consolas"/>
+                <w:lang w:val="en-US"/>
+              </w:rPr>
+              <w:t>titulo.equalsIgnoreCase</w:t>
+            </w:r>
+            <w:proofErr w:type="gramEnd"/>
+            <w:r>
+              <w:rPr>
+                <w:rFonts w:ascii="Consolas" w:hAnsi="Consolas"/>
+                <w:lang w:val="en-US"/>
+              </w:rPr>
+              <w:t>("magister"</w:t>
+            </w:r>
+            <w:proofErr w:type="gramStart"/>
+            <w:r>
+              <w:rPr>
+                <w:rFonts w:ascii="Consolas" w:hAnsi="Consolas"/>
+                <w:lang w:val="en-US"/>
+              </w:rPr>
+              <w:t>)){</w:t>
+            </w:r>
+            <w:proofErr w:type="gramEnd"/>
             <w:r>
               <w:rPr>
                 <w:rFonts w:ascii="Consolas" w:hAnsi="Consolas"/>
@@ -2788,8 +3033,17 @@
                 <w:lang w:val="en-US"/>
               </w:rPr>
               <w:br/>
-              <w:t xml:space="preserve">   }</w:t>
-            </w:r>
+              <w:t xml:space="preserve"> </w:t>
+            </w:r>
+            <w:proofErr w:type="gramStart"/>
+            <w:r>
+              <w:rPr>
+                <w:rFonts w:ascii="Consolas" w:hAnsi="Consolas"/>
+                <w:lang w:val="en-US"/>
+              </w:rPr>
+              <w:t>  }</w:t>
+            </w:r>
+            <w:proofErr w:type="gramEnd"/>
             <w:r>
               <w:rPr>
                 <w:rFonts w:ascii="Consolas" w:hAnsi="Consolas"/>
@@ -2804,7 +3058,23 @@
                 <w:lang w:val="en-US"/>
               </w:rPr>
               <w:br/>
-              <w:t xml:space="preserve">     if(titulo.equalsIgnoreCase("doctor"))</w:t>
+              <w:t xml:space="preserve">     if(</w:t>
+            </w:r>
+            <w:proofErr w:type="gramStart"/>
+            <w:r>
+              <w:rPr>
+                <w:rFonts w:ascii="Consolas" w:hAnsi="Consolas"/>
+                <w:lang w:val="en-US"/>
+              </w:rPr>
+              <w:t>titulo.equalsIgnoreCase</w:t>
+            </w:r>
+            <w:proofErr w:type="gramEnd"/>
+            <w:r>
+              <w:rPr>
+                <w:rFonts w:ascii="Consolas" w:hAnsi="Consolas"/>
+                <w:lang w:val="en-US"/>
+              </w:rPr>
+              <w:t>("doctor"))</w:t>
             </w:r>
           </w:p>
           <w:p>
@@ -2838,8 +3108,16 @@
                 <w:rFonts w:ascii="Consolas" w:hAnsi="Consolas"/>
               </w:rPr>
               <w:br/>
-              <w:t xml:space="preserve">     }</w:t>
-            </w:r>
+              <w:t xml:space="preserve">   </w:t>
+            </w:r>
+            <w:proofErr w:type="gramStart"/>
+            <w:r>
+              <w:rPr>
+                <w:rFonts w:ascii="Consolas" w:hAnsi="Consolas"/>
+              </w:rPr>
+              <w:t>  }</w:t>
+            </w:r>
+            <w:proofErr w:type="gramEnd"/>
             <w:r>
               <w:rPr>
                 <w:rFonts w:ascii="Consolas" w:hAnsi="Consolas"/>
@@ -2858,7 +3136,21 @@
               <w:rPr>
                 <w:rFonts w:ascii="Consolas" w:hAnsi="Consolas"/>
               </w:rPr>
-              <w:t>        throw new TituloNoExistenteException("El tipo de postgrado ingresado no existe");</w:t>
+              <w:t xml:space="preserve">        throw new </w:t>
+            </w:r>
+            <w:proofErr w:type="gramStart"/>
+            <w:r>
+              <w:rPr>
+                <w:rFonts w:ascii="Consolas" w:hAnsi="Consolas"/>
+              </w:rPr>
+              <w:t>TituloNoExistenteException(</w:t>
+            </w:r>
+            <w:proofErr w:type="gramEnd"/>
+            <w:r>
+              <w:rPr>
+                <w:rFonts w:ascii="Consolas" w:hAnsi="Consolas"/>
+              </w:rPr>
+              <w:t>"El tipo de postgrado ingresado no existe");</w:t>
             </w:r>
             <w:r>
               <w:rPr>
@@ -2878,8 +3170,30 @@
                 <w:rFonts w:ascii="Consolas" w:hAnsi="Consolas"/>
               </w:rPr>
               <w:br/>
-              <w:t xml:space="preserve">   if(contratacion.equalsIgnoreCase("permanente")){</w:t>
-            </w:r>
+              <w:t xml:space="preserve">   if(</w:t>
+            </w:r>
+            <w:proofErr w:type="gramStart"/>
+            <w:r>
+              <w:rPr>
+                <w:rFonts w:ascii="Consolas" w:hAnsi="Consolas"/>
+              </w:rPr>
+              <w:t>contratacion.equalsIgnoreCase</w:t>
+            </w:r>
+            <w:proofErr w:type="gramEnd"/>
+            <w:r>
+              <w:rPr>
+                <w:rFonts w:ascii="Consolas" w:hAnsi="Consolas"/>
+              </w:rPr>
+              <w:t>("permanente"</w:t>
+            </w:r>
+            <w:proofErr w:type="gramStart"/>
+            <w:r>
+              <w:rPr>
+                <w:rFonts w:ascii="Consolas" w:hAnsi="Consolas"/>
+              </w:rPr>
+              <w:t>)){</w:t>
+            </w:r>
+            <w:proofErr w:type="gramEnd"/>
             <w:r>
               <w:rPr>
                 <w:rFonts w:ascii="Consolas" w:hAnsi="Consolas"/>
@@ -2892,14 +3206,36 @@
                 <w:rFonts w:ascii="Consolas" w:hAnsi="Consolas"/>
               </w:rPr>
               <w:br/>
-              <w:t xml:space="preserve">   }else</w:t>
-            </w:r>
+              <w:t xml:space="preserve"> </w:t>
+            </w:r>
+            <w:proofErr w:type="gramStart"/>
+            <w:r>
+              <w:rPr>
+                <w:rFonts w:ascii="Consolas" w:hAnsi="Consolas"/>
+              </w:rPr>
+              <w:t>  }else</w:t>
+            </w:r>
+            <w:proofErr w:type="gramEnd"/>
             <w:r>
               <w:rPr>
                 <w:rFonts w:ascii="Consolas" w:hAnsi="Consolas"/>
               </w:rPr>
               <w:br/>
-              <w:t>      if(contratacion.equalsIgnoreCase("residente"))</w:t>
+              <w:t>      if(</w:t>
+            </w:r>
+            <w:proofErr w:type="gramStart"/>
+            <w:r>
+              <w:rPr>
+                <w:rFonts w:ascii="Consolas" w:hAnsi="Consolas"/>
+              </w:rPr>
+              <w:t>contratacion.equalsIgnoreCase</w:t>
+            </w:r>
+            <w:proofErr w:type="gramEnd"/>
+            <w:r>
+              <w:rPr>
+                <w:rFonts w:ascii="Consolas" w:hAnsi="Consolas"/>
+              </w:rPr>
+              <w:t>("residente"))</w:t>
             </w:r>
           </w:p>
           <w:p>
@@ -2926,8 +3262,16 @@
                 <w:rFonts w:ascii="Consolas" w:hAnsi="Consolas"/>
               </w:rPr>
               <w:br/>
-              <w:t>      }</w:t>
-            </w:r>
+              <w:t xml:space="preserve">    </w:t>
+            </w:r>
+            <w:proofErr w:type="gramStart"/>
+            <w:r>
+              <w:rPr>
+                <w:rFonts w:ascii="Consolas" w:hAnsi="Consolas"/>
+              </w:rPr>
+              <w:t>  }</w:t>
+            </w:r>
+            <w:proofErr w:type="gramEnd"/>
             <w:r>
               <w:rPr>
                 <w:rFonts w:ascii="Consolas" w:hAnsi="Consolas"/>
@@ -2940,7 +3284,21 @@
                 <w:rFonts w:ascii="Consolas" w:hAnsi="Consolas"/>
               </w:rPr>
               <w:br/>
-              <w:t>        throw new ContratacionNoExistenteException("El tipo de contratación ingresada no existe");</w:t>
+              <w:t xml:space="preserve">        throw new </w:t>
+            </w:r>
+            <w:proofErr w:type="gramStart"/>
+            <w:r>
+              <w:rPr>
+                <w:rFonts w:ascii="Consolas" w:hAnsi="Consolas"/>
+              </w:rPr>
+              <w:t>ContratacionNoExistenteException(</w:t>
+            </w:r>
+            <w:proofErr w:type="gramEnd"/>
+            <w:r>
+              <w:rPr>
+                <w:rFonts w:ascii="Consolas" w:hAnsi="Consolas"/>
+              </w:rPr>
+              <w:t>"El tipo de contratación ingresada no existe");</w:t>
             </w:r>
             <w:r>
               <w:rPr>
@@ -3068,12 +3426,787 @@
         </w:rPr>
         <w:t xml:space="preserve"> dentro de la clase clínica.</w:t>
       </w:r>
+    </w:p>
+    <w:p>
+      <w:pPr>
+        <w:rPr>
+          <w:rFonts w:ascii="Bahnschrift" w:hAnsi="Bahnschrift"/>
+        </w:rPr>
+      </w:pPr>
       <w:r>
         <w:rPr>
           <w:rFonts w:ascii="Bahnschrift" w:hAnsi="Bahnschrift"/>
         </w:rPr>
         <w:br w:type="page"/>
       </w:r>
+    </w:p>
+    <w:p>
+      <w:pPr>
+        <w:jc w:val="both"/>
+        <w:rPr>
+          <w:rFonts w:ascii="Bahnschrift" w:hAnsi="Bahnschrift"/>
+          <w:b/>
+          <w:bCs/>
+        </w:rPr>
+      </w:pPr>
+      <w:r>
+        <w:rPr>
+          <w:rFonts w:ascii="Bahnschrift" w:hAnsi="Bahnschrift"/>
+          <w:b/>
+          <w:bCs/>
+        </w:rPr>
+        <w:lastRenderedPageBreak/>
+        <w:t>Ambulancia:</w:t>
+      </w:r>
+    </w:p>
+    <w:p>
+      <w:pPr>
+        <w:jc w:val="both"/>
+        <w:rPr>
+          <w:rFonts w:ascii="Bahnschrift" w:hAnsi="Bahnschrift"/>
+        </w:rPr>
+      </w:pPr>
+      <w:r>
+        <w:rPr>
+          <w:rFonts w:ascii="Bahnschrift" w:hAnsi="Bahnschrift"/>
+        </w:rPr>
+        <w:t xml:space="preserve">Para la ambulancia se aplicó el patrón </w:t>
+      </w:r>
+      <w:r>
+        <w:rPr>
+          <w:rFonts w:ascii="Bahnschrift" w:hAnsi="Bahnschrift"/>
+          <w:i/>
+          <w:iCs/>
+        </w:rPr>
+        <w:t>State</w:t>
+      </w:r>
+      <w:r>
+        <w:rPr>
+          <w:rFonts w:ascii="Bahnschrift" w:hAnsi="Bahnschrift"/>
+        </w:rPr>
+        <w:t xml:space="preserve">, </w:t>
+      </w:r>
+      <w:r>
+        <w:rPr>
+          <w:rFonts w:ascii="Bahnschrift" w:hAnsi="Bahnschrift"/>
+        </w:rPr>
+        <w:t>siendo las clases representativas de los estados concretos:</w:t>
+      </w:r>
+    </w:p>
+    <w:p>
+      <w:pPr>
+        <w:pStyle w:val="Prrafodelista"/>
+        <w:numPr>
+          <w:ilvl w:val="0"/>
+          <w:numId w:val="4"/>
+        </w:numPr>
+        <w:spacing w:after="0"/>
+        <w:jc w:val="both"/>
+        <w:rPr>
+          <w:rFonts w:ascii="Bahnschrift" w:hAnsi="Bahnschrift"/>
+        </w:rPr>
+      </w:pPr>
+      <w:r>
+        <w:rPr>
+          <w:rFonts w:ascii="Bahnschrift" w:hAnsi="Bahnschrift"/>
+        </w:rPr>
+        <w:t>AtendiendoEnDomicilio</w:t>
+      </w:r>
+    </w:p>
+    <w:p>
+      <w:pPr>
+        <w:pStyle w:val="Prrafodelista"/>
+        <w:numPr>
+          <w:ilvl w:val="0"/>
+          <w:numId w:val="4"/>
+        </w:numPr>
+        <w:spacing w:after="0"/>
+        <w:jc w:val="both"/>
+        <w:rPr>
+          <w:rFonts w:ascii="Bahnschrift" w:hAnsi="Bahnschrift"/>
+        </w:rPr>
+      </w:pPr>
+      <w:r>
+        <w:rPr>
+          <w:rFonts w:ascii="Bahnschrift" w:hAnsi="Bahnschrift"/>
+        </w:rPr>
+        <w:t>Disponible</w:t>
+      </w:r>
+    </w:p>
+    <w:p>
+      <w:pPr>
+        <w:pStyle w:val="Prrafodelista"/>
+        <w:numPr>
+          <w:ilvl w:val="0"/>
+          <w:numId w:val="4"/>
+        </w:numPr>
+        <w:spacing w:after="0"/>
+        <w:jc w:val="both"/>
+        <w:rPr>
+          <w:rFonts w:ascii="Bahnschrift" w:hAnsi="Bahnschrift"/>
+        </w:rPr>
+      </w:pPr>
+      <w:r>
+        <w:rPr>
+          <w:rFonts w:ascii="Bahnschrift" w:hAnsi="Bahnschrift"/>
+        </w:rPr>
+        <w:t>EnTaller</w:t>
+      </w:r>
+    </w:p>
+    <w:p>
+      <w:pPr>
+        <w:pStyle w:val="Prrafodelista"/>
+        <w:numPr>
+          <w:ilvl w:val="0"/>
+          <w:numId w:val="4"/>
+        </w:numPr>
+        <w:spacing w:after="0"/>
+        <w:jc w:val="both"/>
+        <w:rPr>
+          <w:rFonts w:ascii="Bahnschrift" w:hAnsi="Bahnschrift"/>
+        </w:rPr>
+      </w:pPr>
+      <w:r>
+        <w:rPr>
+          <w:rFonts w:ascii="Bahnschrift" w:hAnsi="Bahnschrift"/>
+        </w:rPr>
+        <w:t>R</w:t>
+      </w:r>
+      <w:r>
+        <w:rPr>
+          <w:rFonts w:ascii="Bahnschrift" w:hAnsi="Bahnschrift"/>
+        </w:rPr>
+        <w:t>egresandoClinicaSinPaciente</w:t>
+      </w:r>
+    </w:p>
+    <w:p>
+      <w:pPr>
+        <w:pStyle w:val="Prrafodelista"/>
+        <w:numPr>
+          <w:ilvl w:val="0"/>
+          <w:numId w:val="4"/>
+        </w:numPr>
+        <w:spacing w:after="0"/>
+        <w:jc w:val="both"/>
+        <w:rPr>
+          <w:rFonts w:ascii="Bahnschrift" w:hAnsi="Bahnschrift"/>
+        </w:rPr>
+      </w:pPr>
+      <w:r>
+        <w:rPr>
+          <w:rFonts w:ascii="Bahnschrift" w:hAnsi="Bahnschrift"/>
+        </w:rPr>
+        <w:t>RegresandoDelTaller</w:t>
+      </w:r>
+    </w:p>
+    <w:p>
+      <w:pPr>
+        <w:pStyle w:val="Prrafodelista"/>
+        <w:numPr>
+          <w:ilvl w:val="0"/>
+          <w:numId w:val="4"/>
+        </w:numPr>
+        <w:spacing w:after="0"/>
+        <w:jc w:val="both"/>
+        <w:rPr>
+          <w:rFonts w:ascii="Bahnschrift" w:hAnsi="Bahnschrift"/>
+        </w:rPr>
+      </w:pPr>
+      <w:r>
+        <w:rPr>
+          <w:rFonts w:ascii="Bahnschrift" w:hAnsi="Bahnschrift"/>
+        </w:rPr>
+        <w:t>TrasladandoPacienteClinica</w:t>
+      </w:r>
+    </w:p>
+    <w:p>
+      <w:pPr>
+        <w:spacing w:before="240"/>
+        <w:jc w:val="both"/>
+        <w:rPr>
+          <w:rFonts w:ascii="Bahnschrift" w:hAnsi="Bahnschrift"/>
+        </w:rPr>
+      </w:pPr>
+      <w:r>
+        <w:rPr>
+          <w:rFonts w:ascii="Bahnschrift" w:hAnsi="Bahnschrift"/>
+        </w:rPr>
+        <w:t xml:space="preserve">También, </w:t>
+      </w:r>
+      <w:r>
+        <w:rPr>
+          <w:rFonts w:ascii="Bahnschrift" w:hAnsi="Bahnschrift"/>
+        </w:rPr>
+        <w:t xml:space="preserve">la ambulancia </w:t>
+      </w:r>
+      <w:r>
+        <w:rPr>
+          <w:rFonts w:ascii="Bahnschrift" w:hAnsi="Bahnschrift"/>
+        </w:rPr>
+        <w:t xml:space="preserve">es parte de un patrón </w:t>
+      </w:r>
+      <w:r>
+        <w:rPr>
+          <w:rFonts w:ascii="Bahnschrift" w:hAnsi="Bahnschrift"/>
+          <w:i/>
+          <w:iCs/>
+        </w:rPr>
+        <w:t>Observer</w:t>
+      </w:r>
+      <w:r>
+        <w:rPr>
+          <w:rFonts w:ascii="Bahnschrift" w:hAnsi="Bahnschrift"/>
+        </w:rPr>
+        <w:t xml:space="preserve">, </w:t>
+      </w:r>
+      <w:r>
+        <w:rPr>
+          <w:rFonts w:ascii="Bahnschrift" w:hAnsi="Bahnschrift"/>
+        </w:rPr>
+        <w:t xml:space="preserve">extendiendo la clase </w:t>
+      </w:r>
+      <w:r>
+        <w:rPr>
+          <w:rFonts w:ascii="Bahnschrift" w:hAnsi="Bahnschrift"/>
+          <w:i/>
+          <w:iCs/>
+        </w:rPr>
+        <w:t>Observable</w:t>
+      </w:r>
+      <w:r>
+        <w:rPr>
+          <w:rFonts w:ascii="Bahnschrift" w:hAnsi="Bahnschrift"/>
+        </w:rPr>
+        <w:t xml:space="preserve">. Simultáneamente </w:t>
+      </w:r>
+      <w:r>
+        <w:rPr>
+          <w:rFonts w:ascii="Bahnschrift" w:hAnsi="Bahnschrift"/>
+        </w:rPr>
+        <w:t>es el recurso compartido</w:t>
+      </w:r>
+      <w:r>
+        <w:rPr>
+          <w:rFonts w:ascii="Bahnschrift" w:hAnsi="Bahnschrift"/>
+        </w:rPr>
+        <w:t xml:space="preserve"> entre los hilos de la simulacón</w:t>
+      </w:r>
+      <w:r>
+        <w:rPr>
+          <w:rFonts w:ascii="Bahnschrift" w:hAnsi="Bahnschrift"/>
+        </w:rPr>
+        <w:t xml:space="preserve">, y notifica a observadores cuando la ambulancia se encuentra en un estado en el que no puede cumplir una solicitud. Hace uso de la sentencia synchronized en los métodos para que no los usen varios hilos a la vez. También usamos la sentencia </w:t>
+      </w:r>
+      <w:proofErr w:type="gramStart"/>
+      <w:r>
+        <w:rPr>
+          <w:rFonts w:ascii="Bahnschrift" w:hAnsi="Bahnschrift"/>
+        </w:rPr>
+        <w:t>wait(</w:t>
+      </w:r>
+      <w:proofErr w:type="gramEnd"/>
+      <w:r>
+        <w:rPr>
+          <w:rFonts w:ascii="Bahnschrift" w:hAnsi="Bahnschrift"/>
+        </w:rPr>
+        <w:t>), para poner a dormir algunos hilos hasta que se cumpla una condición específica, usada para evitar</w:t>
+      </w:r>
+      <w:r>
+        <w:rPr>
+          <w:rFonts w:ascii="Bahnschrift" w:hAnsi="Bahnschrift"/>
+        </w:rPr>
+        <w:t xml:space="preserve"> </w:t>
+      </w:r>
+      <w:r>
+        <w:rPr>
+          <w:rFonts w:ascii="Bahnschrift" w:hAnsi="Bahnschrift"/>
+        </w:rPr>
+        <w:t>errores en ciertos métodos synchronized.</w:t>
+      </w:r>
+    </w:p>
+    <w:p>
+      <w:pPr>
+        <w:rPr>
+          <w:rFonts w:ascii="Bahnschrift" w:hAnsi="Bahnschrift"/>
+        </w:rPr>
+      </w:pPr>
+      <w:r>
+        <w:rPr>
+          <w:rFonts w:ascii="Bahnschrift" w:hAnsi="Bahnschrift"/>
+        </w:rPr>
+        <w:br w:type="page"/>
+      </w:r>
+    </w:p>
+    <w:p>
+      <w:pPr>
+        <w:jc w:val="both"/>
+        <w:rPr>
+          <w:rFonts w:ascii="Bahnschrift" w:hAnsi="Bahnschrift"/>
+          <w:b/>
+          <w:bCs/>
+        </w:rPr>
+      </w:pPr>
+      <w:r>
+        <w:rPr>
+          <w:rFonts w:ascii="Bahnschrift" w:hAnsi="Bahnschrift"/>
+        </w:rPr>
+        <w:lastRenderedPageBreak/>
+        <w:t xml:space="preserve"> </w:t>
+      </w:r>
+      <w:r>
+        <w:rPr>
+          <w:rFonts w:ascii="Bahnschrift" w:hAnsi="Bahnschrift"/>
+          <w:b/>
+          <w:bCs/>
+        </w:rPr>
+        <w:t>Asociado</w:t>
+      </w:r>
+      <w:r>
+        <w:rPr>
+          <w:rFonts w:ascii="Bahnschrift" w:hAnsi="Bahnschrift"/>
+          <w:b/>
+          <w:bCs/>
+        </w:rPr>
+        <w:t>:</w:t>
+      </w:r>
+    </w:p>
+    <w:p>
+      <w:pPr>
+        <w:jc w:val="both"/>
+        <w:rPr>
+          <w:rFonts w:ascii="Bahnschrift" w:hAnsi="Bahnschrift"/>
+        </w:rPr>
+      </w:pPr>
+      <w:r>
+        <w:rPr>
+          <w:rFonts w:ascii="Bahnschrift" w:hAnsi="Bahnschrift"/>
+        </w:rPr>
+        <w:t>Los asociados son parte d</w:t>
+      </w:r>
+      <w:r>
+        <w:rPr>
+          <w:rFonts w:ascii="Bahnschrift" w:hAnsi="Bahnschrift"/>
+        </w:rPr>
+        <w:t>el</w:t>
+      </w:r>
+      <w:r>
+        <w:rPr>
+          <w:rFonts w:ascii="Bahnschrift" w:hAnsi="Bahnschrift"/>
+        </w:rPr>
+        <w:t xml:space="preserve"> patrón </w:t>
+      </w:r>
+      <w:r>
+        <w:rPr>
+          <w:rFonts w:ascii="Bahnschrift" w:hAnsi="Bahnschrift"/>
+          <w:i/>
+          <w:iCs/>
+        </w:rPr>
+        <w:t>Observer</w:t>
+      </w:r>
+      <w:r>
+        <w:rPr>
+          <w:rFonts w:ascii="Bahnschrift" w:hAnsi="Bahnschrift"/>
+        </w:rPr>
+        <w:t>,</w:t>
+      </w:r>
+      <w:r>
+        <w:rPr>
+          <w:rFonts w:ascii="Bahnschrift" w:hAnsi="Bahnschrift"/>
+        </w:rPr>
+        <w:t xml:space="preserve"> extendiendo la clase </w:t>
+      </w:r>
+      <w:r>
+        <w:rPr>
+          <w:rFonts w:ascii="Bahnschrift" w:hAnsi="Bahnschrift"/>
+          <w:i/>
+          <w:iCs/>
+        </w:rPr>
+        <w:t>Observable</w:t>
+      </w:r>
+      <w:r>
+        <w:rPr>
+          <w:rFonts w:ascii="Bahnschrift" w:hAnsi="Bahnschrift"/>
+        </w:rPr>
+        <w:t>, implementando</w:t>
+      </w:r>
+      <w:r>
+        <w:rPr>
+          <w:rFonts w:ascii="Bahnschrift" w:hAnsi="Bahnschrift"/>
+        </w:rPr>
+        <w:t xml:space="preserve"> la interfaz </w:t>
+      </w:r>
+      <w:r>
+        <w:rPr>
+          <w:rFonts w:ascii="Bahnschrift" w:hAnsi="Bahnschrift"/>
+          <w:i/>
+          <w:iCs/>
+        </w:rPr>
+        <w:t>R</w:t>
+      </w:r>
+      <w:r>
+        <w:rPr>
+          <w:rFonts w:ascii="Bahnschrift" w:hAnsi="Bahnschrift"/>
+          <w:i/>
+          <w:iCs/>
+        </w:rPr>
+        <w:t>unneable</w:t>
+      </w:r>
+      <w:r>
+        <w:rPr>
+          <w:rFonts w:ascii="Bahnschrift" w:hAnsi="Bahnschrift"/>
+          <w:i/>
+          <w:iCs/>
+        </w:rPr>
+        <w:t xml:space="preserve"> </w:t>
+      </w:r>
+      <w:r>
+        <w:rPr>
+          <w:rFonts w:ascii="Bahnschrift" w:hAnsi="Bahnschrift"/>
+        </w:rPr>
+        <w:t>(</w:t>
+      </w:r>
+      <w:r>
+        <w:rPr>
+          <w:rFonts w:ascii="Bahnschrift" w:hAnsi="Bahnschrift"/>
+        </w:rPr>
+        <w:t>para simular la concurrencia</w:t>
+      </w:r>
+      <w:r>
+        <w:rPr>
+          <w:rFonts w:ascii="Bahnschrift" w:hAnsi="Bahnschrift"/>
+        </w:rPr>
+        <w:t>)</w:t>
+      </w:r>
+      <w:r>
+        <w:rPr>
+          <w:rFonts w:ascii="Bahnschrift" w:hAnsi="Bahnschrift"/>
+        </w:rPr>
+        <w:t xml:space="preserve"> y </w:t>
+      </w:r>
+      <w:r>
+        <w:rPr>
+          <w:rFonts w:ascii="Bahnschrift" w:hAnsi="Bahnschrift"/>
+        </w:rPr>
+        <w:t>notifican</w:t>
+      </w:r>
+      <w:r>
+        <w:rPr>
+          <w:rFonts w:ascii="Bahnschrift" w:hAnsi="Bahnschrift"/>
+        </w:rPr>
+        <w:t>do a los observadores</w:t>
+      </w:r>
+      <w:r>
+        <w:rPr>
+          <w:rFonts w:ascii="Bahnschrift" w:hAnsi="Bahnschrift"/>
+        </w:rPr>
+        <w:t xml:space="preserve"> cuando </w:t>
+      </w:r>
+      <w:r>
+        <w:rPr>
+          <w:rFonts w:ascii="Bahnschrift" w:hAnsi="Bahnschrift"/>
+        </w:rPr>
+        <w:t>y para qué</w:t>
+      </w:r>
+      <w:r>
+        <w:rPr>
+          <w:rFonts w:ascii="Bahnschrift" w:hAnsi="Bahnschrift"/>
+        </w:rPr>
+        <w:t xml:space="preserve"> </w:t>
+      </w:r>
+      <w:r>
+        <w:rPr>
+          <w:rFonts w:ascii="Bahnschrift" w:hAnsi="Bahnschrift"/>
+        </w:rPr>
+        <w:t xml:space="preserve">están </w:t>
+      </w:r>
+      <w:r>
+        <w:rPr>
+          <w:rFonts w:ascii="Bahnschrift" w:hAnsi="Bahnschrift"/>
+        </w:rPr>
+        <w:t>usando la ambulancia</w:t>
+      </w:r>
+      <w:r>
+        <w:rPr>
+          <w:rFonts w:ascii="Bahnschrift" w:hAnsi="Bahnschrift"/>
+        </w:rPr>
+        <w:t>.</w:t>
+      </w:r>
+      <w:r>
+        <w:rPr>
+          <w:rFonts w:ascii="Bahnschrift" w:hAnsi="Bahnschrift"/>
+        </w:rPr>
+        <w:t xml:space="preserve"> </w:t>
+      </w:r>
+      <w:r>
+        <w:rPr>
+          <w:rFonts w:ascii="Bahnschrift" w:hAnsi="Bahnschrift"/>
+        </w:rPr>
+        <w:t>S</w:t>
+      </w:r>
+      <w:r>
+        <w:rPr>
+          <w:rFonts w:ascii="Bahnschrift" w:hAnsi="Bahnschrift"/>
+        </w:rPr>
+        <w:t>on hilos que interactúan con la ambulancia, intentando tomar control del recurso compartido. Las acciones que toman sobre la ambulancia son aleatorias.</w:t>
+      </w:r>
+    </w:p>
+    <w:p>
+      <w:pPr>
+        <w:rPr>
+          <w:rFonts w:ascii="Bahnschrift" w:hAnsi="Bahnschrift"/>
+        </w:rPr>
+      </w:pPr>
+      <w:r>
+        <w:rPr>
+          <w:rFonts w:ascii="Bahnschrift" w:hAnsi="Bahnschrift"/>
+        </w:rPr>
+        <w:br w:type="page"/>
+      </w:r>
+    </w:p>
+    <w:p>
+      <w:pPr>
+        <w:jc w:val="both"/>
+        <w:rPr>
+          <w:rFonts w:ascii="Bahnschrift" w:hAnsi="Bahnschrift"/>
+          <w:b/>
+          <w:bCs/>
+        </w:rPr>
+      </w:pPr>
+      <w:r>
+        <w:rPr>
+          <w:rFonts w:ascii="Bahnschrift" w:hAnsi="Bahnschrift"/>
+          <w:b/>
+          <w:bCs/>
+        </w:rPr>
+        <w:lastRenderedPageBreak/>
+        <w:t>Operar</w:t>
+      </w:r>
+      <w:r>
+        <w:rPr>
+          <w:rFonts w:ascii="Bahnschrift" w:hAnsi="Bahnschrift"/>
+          <w:b/>
+          <w:bCs/>
+        </w:rPr>
+        <w:t>io:</w:t>
+      </w:r>
+    </w:p>
+    <w:p>
+      <w:pPr>
+        <w:jc w:val="both"/>
+        <w:rPr>
+          <w:rFonts w:ascii="Bahnschrift" w:hAnsi="Bahnschrift"/>
+        </w:rPr>
+      </w:pPr>
+      <w:r>
+        <w:rPr>
+          <w:rFonts w:ascii="Bahnschrift" w:hAnsi="Bahnschrift"/>
+        </w:rPr>
+        <w:t xml:space="preserve">El operario también </w:t>
+      </w:r>
+      <w:r>
+        <w:rPr>
+          <w:rFonts w:ascii="Bahnschrift" w:hAnsi="Bahnschrift"/>
+        </w:rPr>
+        <w:t xml:space="preserve">extiende a </w:t>
+      </w:r>
+      <w:r>
+        <w:rPr>
+          <w:rFonts w:ascii="Bahnschrift" w:hAnsi="Bahnschrift"/>
+          <w:i/>
+          <w:iCs/>
+        </w:rPr>
+        <w:t xml:space="preserve">Observable </w:t>
+      </w:r>
+      <w:r>
+        <w:rPr>
+          <w:rFonts w:ascii="Bahnschrift" w:hAnsi="Bahnschrift"/>
+        </w:rPr>
+        <w:t>e implementa la interfaz R</w:t>
+      </w:r>
+      <w:r>
+        <w:rPr>
+          <w:rFonts w:ascii="Bahnschrift" w:hAnsi="Bahnschrift"/>
+          <w:i/>
+          <w:iCs/>
+        </w:rPr>
+        <w:t>unneable</w:t>
+      </w:r>
+      <w:r>
+        <w:rPr>
+          <w:rFonts w:ascii="Bahnschrift" w:hAnsi="Bahnschrift"/>
+        </w:rPr>
+        <w:t xml:space="preserve">, </w:t>
+      </w:r>
+      <w:r>
+        <w:rPr>
+          <w:rFonts w:ascii="Bahnschrift" w:hAnsi="Bahnschrift"/>
+        </w:rPr>
+        <w:t xml:space="preserve">y </w:t>
+      </w:r>
+      <w:r>
+        <w:rPr>
+          <w:rFonts w:ascii="Bahnschrift" w:hAnsi="Bahnschrift"/>
+        </w:rPr>
+        <w:t xml:space="preserve">notifica cuando está usando la ambulancia </w:t>
+      </w:r>
+      <w:r>
+        <w:rPr>
+          <w:rFonts w:ascii="Bahnschrift" w:hAnsi="Bahnschrift"/>
+        </w:rPr>
+        <w:t xml:space="preserve">para </w:t>
+      </w:r>
+      <w:r>
+        <w:rPr>
+          <w:rFonts w:ascii="Bahnschrift" w:hAnsi="Bahnschrift"/>
+        </w:rPr>
+        <w:t>solicita</w:t>
+      </w:r>
+      <w:r>
+        <w:rPr>
+          <w:rFonts w:ascii="Bahnschrift" w:hAnsi="Bahnschrift"/>
+        </w:rPr>
+        <w:t>r</w:t>
+      </w:r>
+      <w:r>
+        <w:rPr>
+          <w:rFonts w:ascii="Bahnschrift" w:hAnsi="Bahnschrift"/>
+        </w:rPr>
+        <w:t xml:space="preserve"> mantenimiento</w:t>
+      </w:r>
+      <w:r>
+        <w:rPr>
+          <w:rFonts w:ascii="Bahnschrift" w:hAnsi="Bahnschrift"/>
+        </w:rPr>
+        <w:t>.</w:t>
+      </w:r>
+      <w:r>
+        <w:rPr>
+          <w:rFonts w:ascii="Bahnschrift" w:hAnsi="Bahnschrift"/>
+        </w:rPr>
+        <w:t xml:space="preserve"> </w:t>
+      </w:r>
+      <w:r>
+        <w:rPr>
+          <w:rFonts w:ascii="Bahnschrift" w:hAnsi="Bahnschrift"/>
+        </w:rPr>
+        <w:t>E</w:t>
+      </w:r>
+      <w:r>
+        <w:rPr>
+          <w:rFonts w:ascii="Bahnschrift" w:hAnsi="Bahnschrift"/>
+        </w:rPr>
+        <w:t xml:space="preserve">l </w:t>
+      </w:r>
+      <w:r>
+        <w:rPr>
+          <w:rFonts w:ascii="Bahnschrift" w:hAnsi="Bahnschrift"/>
+        </w:rPr>
+        <w:t xml:space="preserve">intento de tomar el recurso compartido no es constante, el </w:t>
+      </w:r>
+      <w:r>
+        <w:rPr>
+          <w:rFonts w:ascii="Bahnschrift" w:hAnsi="Bahnschrift"/>
+        </w:rPr>
+        <w:t xml:space="preserve">operario </w:t>
+      </w:r>
+      <w:r>
+        <w:rPr>
+          <w:rFonts w:ascii="Bahnschrift" w:hAnsi="Bahnschrift"/>
+        </w:rPr>
+        <w:t>espera cierto tiempo aleatorio luego de solicitar el mantenimiento para competir por el recurso compartido de nuevo</w:t>
+      </w:r>
+      <w:r>
+        <w:rPr>
+          <w:rFonts w:ascii="Bahnschrift" w:hAnsi="Bahnschrift"/>
+        </w:rPr>
+        <w:t xml:space="preserve">. </w:t>
+      </w:r>
+      <w:r>
+        <w:rPr>
+          <w:rFonts w:ascii="Bahnschrift" w:hAnsi="Bahnschrift"/>
+        </w:rPr>
+        <w:t>En resumen, e</w:t>
+      </w:r>
+      <w:r>
+        <w:rPr>
+          <w:rFonts w:ascii="Bahnschrift" w:hAnsi="Bahnschrift"/>
+        </w:rPr>
+        <w:t>s un hilo que se encarga de mandar la ambulancia al mantenimiento cada cierto tiempo.</w:t>
+      </w:r>
+    </w:p>
+    <w:p>
+      <w:pPr>
+        <w:rPr>
+          <w:rFonts w:ascii="Bahnschrift" w:hAnsi="Bahnschrift"/>
+        </w:rPr>
+      </w:pPr>
+      <w:r>
+        <w:rPr>
+          <w:rFonts w:ascii="Bahnschrift" w:hAnsi="Bahnschrift"/>
+        </w:rPr>
+        <w:br w:type="page"/>
+      </w:r>
+      <w:r>
+        <w:rPr>
+          <w:rFonts w:ascii="Bahnschrift" w:hAnsi="Bahnschrift"/>
+          <w:b/>
+          <w:bCs/>
+        </w:rPr>
+        <w:lastRenderedPageBreak/>
+        <w:t>Retorno Automático</w:t>
+      </w:r>
+      <w:r>
+        <w:rPr>
+          <w:rFonts w:ascii="Bahnschrift" w:hAnsi="Bahnschrift"/>
+        </w:rPr>
+        <w:t>:</w:t>
+      </w:r>
+    </w:p>
+    <w:p>
+      <w:pPr>
+        <w:rPr>
+          <w:rFonts w:ascii="Bahnschrift" w:hAnsi="Bahnschrift"/>
+        </w:rPr>
+      </w:pPr>
+      <w:r>
+        <w:rPr>
+          <w:rFonts w:ascii="Bahnschrift" w:hAnsi="Bahnschrift"/>
+        </w:rPr>
+        <w:t xml:space="preserve">Esta clase es vital para la simulación, ya que es una clase que implementa la interfaz </w:t>
+      </w:r>
+      <w:r>
+        <w:rPr>
+          <w:rFonts w:ascii="Bahnschrift" w:hAnsi="Bahnschrift"/>
+          <w:i/>
+          <w:iCs/>
+        </w:rPr>
+        <w:t>Runneable</w:t>
+      </w:r>
+      <w:r>
+        <w:rPr>
+          <w:rFonts w:ascii="Bahnschrift" w:hAnsi="Bahnschrift"/>
+        </w:rPr>
+        <w:t xml:space="preserve"> y que cada cierto intervalo fijo de tiempo va a intentar tomar control del recurso compartido y va a hacer que retorne la ambulancia</w:t>
+      </w:r>
+      <w:r>
+        <w:rPr>
+          <w:rFonts w:ascii="Bahnschrift" w:hAnsi="Bahnschrift"/>
+        </w:rPr>
+        <w:t xml:space="preserve"> a la clínica.</w:t>
+      </w:r>
+      <w:r>
+        <w:rPr>
+          <w:rFonts w:ascii="Bahnschrift" w:hAnsi="Bahnschrift"/>
+        </w:rPr>
+        <w:br w:type="page"/>
+      </w:r>
+    </w:p>
+    <w:p>
+      <w:pPr>
+        <w:rPr>
+          <w:rFonts w:ascii="Bahnschrift" w:hAnsi="Bahnschrift"/>
+        </w:rPr>
+      </w:pPr>
     </w:p>
     <w:p>
       <w:pPr>
@@ -3098,7 +4231,6 @@
           <w:szCs w:val="28"/>
           <w:u w:val="single"/>
         </w:rPr>
-        <w:lastRenderedPageBreak/>
         <w:t>Descripción de Módulos</w:t>
       </w:r>
     </w:p>
@@ -3509,6 +4641,125 @@
           <w:rFonts w:ascii="Bahnschrift" w:hAnsi="Bahnschrift"/>
         </w:rPr>
         <w:t>para cada uno.</w:t>
+      </w:r>
+    </w:p>
+    <w:p>
+      <w:pPr>
+        <w:rPr>
+          <w:rFonts w:ascii="Bahnschrift" w:hAnsi="Bahnschrift"/>
+        </w:rPr>
+      </w:pPr>
+      <w:r>
+        <w:rPr>
+          <w:rFonts w:ascii="Bahnschrift" w:hAnsi="Bahnschrift"/>
+        </w:rPr>
+        <w:br w:type="page"/>
+      </w:r>
+    </w:p>
+    <w:p>
+      <w:pPr>
+        <w:jc w:val="center"/>
+        <w:rPr>
+          <w:rFonts w:ascii="Bahnschrift" w:hAnsi="Bahnschrift"/>
+          <w:b/>
+          <w:bCs/>
+          <w:color w:val="5B9BD5" w:themeColor="accent1"/>
+          <w:sz w:val="28"/>
+          <w:szCs w:val="28"/>
+          <w:u w:val="single"/>
+        </w:rPr>
+      </w:pPr>
+      <w:r>
+        <w:rPr>
+          <w:rFonts w:ascii="Bahnschrift" w:hAnsi="Bahnschrift"/>
+          <w:b/>
+          <w:bCs/>
+          <w:color w:val="5B9BD5" w:themeColor="accent1"/>
+          <w:sz w:val="28"/>
+          <w:szCs w:val="28"/>
+          <w:u w:val="single"/>
+        </w:rPr>
+        <w:lastRenderedPageBreak/>
+        <w:t>Descripción de Modelos</w:t>
+      </w:r>
+    </w:p>
+    <w:p>
+      <w:pPr>
+        <w:rPr>
+          <w:rFonts w:ascii="Bahnschrift" w:hAnsi="Bahnschrift"/>
+          <w:b/>
+          <w:bCs/>
+        </w:rPr>
+      </w:pPr>
+      <w:r>
+        <w:rPr>
+          <w:rFonts w:ascii="Bahnschrift" w:hAnsi="Bahnschrift"/>
+          <w:b/>
+          <w:bCs/>
+        </w:rPr>
+        <w:t>Modelo Aplicación:</w:t>
+      </w:r>
+    </w:p>
+    <w:p>
+      <w:pPr>
+        <w:jc w:val="both"/>
+        <w:rPr>
+          <w:rFonts w:ascii="Bahnschrift" w:hAnsi="Bahnschrift"/>
+        </w:rPr>
+      </w:pPr>
+      <w:r>
+        <w:rPr>
+          <w:rFonts w:ascii="Bahnschrift" w:hAnsi="Bahnschrift"/>
+        </w:rPr>
+        <w:t>Este modelo está constituido por dos clases, la clase NotificacionSimulacion, cuya función es almacenar información de una notificación específica que podría generarse dentro de la simulación. La otra clase es ObservadorSimulacion, que tiene como función recibir las notificaciones del observable (en este caso la simulación), y actualizar la vista, cambiando el estado de la simulación.</w:t>
+      </w:r>
+    </w:p>
+    <w:p>
+      <w:pPr>
+        <w:jc w:val="both"/>
+        <w:rPr>
+          <w:rFonts w:ascii="Bahnschrift" w:hAnsi="Bahnschrift"/>
+        </w:rPr>
+      </w:pPr>
+    </w:p>
+    <w:p>
+      <w:pPr>
+        <w:jc w:val="both"/>
+        <w:rPr>
+          <w:rFonts w:ascii="Bahnschrift" w:hAnsi="Bahnschrift"/>
+          <w:b/>
+          <w:bCs/>
+        </w:rPr>
+      </w:pPr>
+      <w:r>
+        <w:rPr>
+          <w:rFonts w:ascii="Bahnschrift" w:hAnsi="Bahnschrift"/>
+          <w:b/>
+          <w:bCs/>
+        </w:rPr>
+        <w:t>Modelo Dominio</w:t>
+      </w:r>
+      <w:r>
+        <w:rPr>
+          <w:rFonts w:ascii="Bahnschrift" w:hAnsi="Bahnschrift"/>
+          <w:b/>
+          <w:bCs/>
+        </w:rPr>
+        <w:t>:</w:t>
+      </w:r>
+    </w:p>
+    <w:p>
+      <w:pPr>
+        <w:jc w:val="both"/>
+        <w:rPr>
+          <w:rFonts w:ascii="Bahnschrift" w:hAnsi="Bahnschrift"/>
+        </w:rPr>
+      </w:pPr>
+      <w:r>
+        <w:rPr>
+          <w:rFonts w:ascii="Bahnschrift" w:hAnsi="Bahnschrift"/>
+        </w:rPr>
+        <w:t>Este modelo es el que posee las clases principales, contiene a: la Ambulancia, la propia Clinica, la clase Habitaciones y la clase Personas, entre otras clases como Domicilio y TiempoMuerto, así como también una serie de posibles excepciones a algunos métodos y procesos.</w:t>
       </w:r>
     </w:p>
     <w:sectPr>
@@ -3801,7 +5052,7 @@
 <w:numbering xmlns:wpc="http://schemas.microsoft.com/office/word/2010/wordprocessingCanvas" xmlns:cx="http://schemas.microsoft.com/office/drawing/2014/chartex" xmlns:cx1="http://schemas.microsoft.com/office/drawing/2015/9/8/chartex" xmlns:cx2="http://schemas.microsoft.com/office/drawing/2015/10/21/chartex" xmlns:cx3="http://schemas.microsoft.com/office/drawing/2016/5/9/chartex" xmlns:cx4="http://schemas.microsoft.com/office/drawing/2016/5/10/chartex" xmlns:cx5="http://schemas.microsoft.com/office/drawing/2016/5/11/chartex" xmlns:cx6="http://schemas.microsoft.com/office/drawing/2016/5/12/chartex" xmlns:cx7="http://schemas.microsoft.com/office/drawing/2016/5/13/chartex" xmlns:cx8="http://schemas.microsoft.com/office/drawing/2016/5/14/chartex" xmlns:mc="http://schemas.openxmlformats.org/markup-compatibility/2006" xmlns:aink="http://schemas.microsoft.com/office/drawing/2016/ink" xmlns:am3d="http://schemas.microsoft.com/office/drawing/2017/model3d" xmlns:o="urn:schemas-microsoft-com:office:office" xmlns:oel="http://schemas.microsoft.com/office/2019/extlst" xmlns:r="http://schemas.openxmlformats.org/officeDocument/2006/relationships" xmlns:m="http://schemas.openxmlformats.org/officeDocument/2006/math" xmlns:v="urn:schemas-microsoft-com:vml" xmlns:wp14="http://schemas.microsoft.com/office/word/2010/wordprocessingDrawing" xmlns:wp="http://schemas.openxmlformats.org/drawingml/2006/wordprocessingDrawing" xmlns:w10="urn:schemas-microsoft-com:office:word" xmlns:w="http://schemas.openxmlformats.org/wordprocessingml/2006/main" xmlns:w14="http://schemas.microsoft.com/office/word/2010/wordml" xmlns:w15="http://schemas.microsoft.com/office/word/2012/wordml" xmlns:w16cex="http://schemas.microsoft.com/office/word/2018/wordml/cex" xmlns:w16cid="http://schemas.microsoft.com/office/word/2016/wordml/cid" xmlns:w16="http://schemas.microsoft.com/office/word/2018/wordml" xmlns:w16du="http://schemas.microsoft.com/office/word/2023/wordml/word16du" xmlns:w16sdtdh="http://schemas.microsoft.com/office/word/2020/wordml/sdtdatahash" xmlns:w16sdtfl="http://schemas.microsoft.com/office/word/2024/wordml/sdtformatlock" xmlns:w16se="http://schemas.microsoft.com/office/word/2015/wordml/symex" xmlns:wpg="http://schemas.microsoft.com/office/word/2010/wordprocessingGroup" xmlns:wpi="http://schemas.microsoft.com/office/word/2010/wordprocessingInk" xmlns:wne="http://schemas.microsoft.com/office/word/2006/wordml" xmlns:wps="http://schemas.microsoft.com/office/word/2010/wordprocessingShape" mc:Ignorable="w14 w15 w16se w16cid w16 w16cex w16sdtdh w16sdtfl w16du wp14">
   <w:numPicBullet w:numPicBulletId="0">
     <w:pict>
-      <v:shapetype w14:anchorId="1C3857BF" id="_x0000_t75" coordsize="21600,21600" o:spt="75" o:preferrelative="t" path="m@4@5l@4@11@9@11@9@5xe" filled="f" stroked="f">
+      <v:shapetype id="_x0000_t75" coordsize="21600,21600" o:spt="75" o:preferrelative="t" path="m@4@5l@4@11@9@11@9@5xe" filled="f" stroked="f">
         <v:stroke joinstyle="miter"/>
         <v:formulas>
           <v:f eqn="if lineDrawn pixelLineWidth 0"/>
@@ -3820,7 +5071,7 @@
         <v:path o:extrusionok="f" gradientshapeok="t" o:connecttype="rect"/>
         <o:lock v:ext="edit" aspectratio="t"/>
       </v:shapetype>
-      <v:shape id="_x0000_i1036" type="#_x0000_t75" style="width:11.25pt;height:11.25pt" o:bullet="t">
+      <v:shape id="_x0000_i1078" type="#_x0000_t75" style="width:11.25pt;height:11.25pt" o:bullet="t">
         <v:imagedata r:id="rId1" o:title="mso3DBA"/>
       </v:shape>
     </w:pict>
@@ -3975,6 +5226,120 @@
     </w:lvl>
   </w:abstractNum>
   <w:abstractNum w:abstractNumId="1" w15:restartNumberingAfterBreak="0">
+    <w:nsid w:val="163524A2"/>
+    <w:multiLevelType w:val="hybridMultilevel"/>
+    <w:tmpl w:val="DCD0CBDE"/>
+    <w:lvl w:ilvl="0" w:tplc="ABE861A6">
+      <w:start w:val="1"/>
+      <w:numFmt w:val="bullet"/>
+      <w:lvlText w:val=""/>
+      <w:lvlJc w:val="left"/>
+      <w:pPr>
+        <w:ind w:left="720" w:hanging="360"/>
+      </w:pPr>
+      <w:rPr>
+        <w:rFonts w:ascii="Wingdings" w:hAnsi="Wingdings" w:hint="default"/>
+        <w:color w:val="5B9BD5" w:themeColor="accent1"/>
+      </w:rPr>
+    </w:lvl>
+    <w:lvl w:ilvl="1" w:tplc="2C0A0003" w:tentative="1">
+      <w:start w:val="1"/>
+      <w:numFmt w:val="bullet"/>
+      <w:lvlText w:val="o"/>
+      <w:lvlJc w:val="left"/>
+      <w:pPr>
+        <w:ind w:left="1440" w:hanging="360"/>
+      </w:pPr>
+      <w:rPr>
+        <w:rFonts w:ascii="Courier New" w:hAnsi="Courier New" w:cs="Courier New" w:hint="default"/>
+      </w:rPr>
+    </w:lvl>
+    <w:lvl w:ilvl="2" w:tplc="2C0A0005" w:tentative="1">
+      <w:start w:val="1"/>
+      <w:numFmt w:val="bullet"/>
+      <w:lvlText w:val=""/>
+      <w:lvlJc w:val="left"/>
+      <w:pPr>
+        <w:ind w:left="2160" w:hanging="360"/>
+      </w:pPr>
+      <w:rPr>
+        <w:rFonts w:ascii="Wingdings" w:hAnsi="Wingdings" w:hint="default"/>
+      </w:rPr>
+    </w:lvl>
+    <w:lvl w:ilvl="3" w:tplc="2C0A0001" w:tentative="1">
+      <w:start w:val="1"/>
+      <w:numFmt w:val="bullet"/>
+      <w:lvlText w:val=""/>
+      <w:lvlJc w:val="left"/>
+      <w:pPr>
+        <w:ind w:left="2880" w:hanging="360"/>
+      </w:pPr>
+      <w:rPr>
+        <w:rFonts w:ascii="Symbol" w:hAnsi="Symbol" w:hint="default"/>
+      </w:rPr>
+    </w:lvl>
+    <w:lvl w:ilvl="4" w:tplc="2C0A0003" w:tentative="1">
+      <w:start w:val="1"/>
+      <w:numFmt w:val="bullet"/>
+      <w:lvlText w:val="o"/>
+      <w:lvlJc w:val="left"/>
+      <w:pPr>
+        <w:ind w:left="3600" w:hanging="360"/>
+      </w:pPr>
+      <w:rPr>
+        <w:rFonts w:ascii="Courier New" w:hAnsi="Courier New" w:cs="Courier New" w:hint="default"/>
+      </w:rPr>
+    </w:lvl>
+    <w:lvl w:ilvl="5" w:tplc="2C0A0005" w:tentative="1">
+      <w:start w:val="1"/>
+      <w:numFmt w:val="bullet"/>
+      <w:lvlText w:val=""/>
+      <w:lvlJc w:val="left"/>
+      <w:pPr>
+        <w:ind w:left="4320" w:hanging="360"/>
+      </w:pPr>
+      <w:rPr>
+        <w:rFonts w:ascii="Wingdings" w:hAnsi="Wingdings" w:hint="default"/>
+      </w:rPr>
+    </w:lvl>
+    <w:lvl w:ilvl="6" w:tplc="2C0A0001" w:tentative="1">
+      <w:start w:val="1"/>
+      <w:numFmt w:val="bullet"/>
+      <w:lvlText w:val=""/>
+      <w:lvlJc w:val="left"/>
+      <w:pPr>
+        <w:ind w:left="5040" w:hanging="360"/>
+      </w:pPr>
+      <w:rPr>
+        <w:rFonts w:ascii="Symbol" w:hAnsi="Symbol" w:hint="default"/>
+      </w:rPr>
+    </w:lvl>
+    <w:lvl w:ilvl="7" w:tplc="2C0A0003" w:tentative="1">
+      <w:start w:val="1"/>
+      <w:numFmt w:val="bullet"/>
+      <w:lvlText w:val="o"/>
+      <w:lvlJc w:val="left"/>
+      <w:pPr>
+        <w:ind w:left="5760" w:hanging="360"/>
+      </w:pPr>
+      <w:rPr>
+        <w:rFonts w:ascii="Courier New" w:hAnsi="Courier New" w:cs="Courier New" w:hint="default"/>
+      </w:rPr>
+    </w:lvl>
+    <w:lvl w:ilvl="8" w:tplc="2C0A0005" w:tentative="1">
+      <w:start w:val="1"/>
+      <w:numFmt w:val="bullet"/>
+      <w:lvlText w:val=""/>
+      <w:lvlJc w:val="left"/>
+      <w:pPr>
+        <w:ind w:left="6480" w:hanging="360"/>
+      </w:pPr>
+      <w:rPr>
+        <w:rFonts w:ascii="Wingdings" w:hAnsi="Wingdings" w:hint="default"/>
+      </w:rPr>
+    </w:lvl>
+  </w:abstractNum>
+  <w:abstractNum w:abstractNumId="2" w15:restartNumberingAfterBreak="0">
     <w:nsid w:val="4DFA232C"/>
     <w:multiLevelType w:val="hybridMultilevel"/>
     <w:tmpl w:val="19D0B9F2"/>
@@ -4088,7 +5453,7 @@
       </w:rPr>
     </w:lvl>
   </w:abstractNum>
-  <w:abstractNum w:abstractNumId="2" w15:restartNumberingAfterBreak="0">
+  <w:abstractNum w:abstractNumId="3" w15:restartNumberingAfterBreak="0">
     <w:nsid w:val="5E3B4204"/>
     <w:multiLevelType w:val="multilevel"/>
     <w:tmpl w:val="93800396"/>
@@ -4238,12 +5603,15 @@
     </w:lvl>
   </w:abstractNum>
   <w:num w:numId="1" w16cid:durableId="32734006">
-    <w:abstractNumId w:val="2"/>
+    <w:abstractNumId w:val="3"/>
   </w:num>
   <w:num w:numId="2" w16cid:durableId="1161430159">
     <w:abstractNumId w:val="0"/>
   </w:num>
   <w:num w:numId="3" w16cid:durableId="1710178082">
+    <w:abstractNumId w:val="2"/>
+  </w:num>
+  <w:num w:numId="4" w16cid:durableId="937182155">
     <w:abstractNumId w:val="1"/>
   </w:num>
 </w:numbering>
@@ -4854,7 +6222,6 @@
   <w:style w:type="character" w:default="1" w:styleId="Fuentedeprrafopredeter">
     <w:name w:val="Default Paragraph Font"/>
     <w:uiPriority w:val="1"/>
-    <w:semiHidden/>
     <w:unhideWhenUsed/>
   </w:style>
   <w:style w:type="table" w:default="1" w:styleId="Tablanormal">

</xml_diff>